<commit_message>
trabalhando em caso de uso
</commit_message>
<xml_diff>
--- a/documentação/Requisitos/UC21 -AREA DE TRABALHO - CLINICA.docx
+++ b/documentação/Requisitos/UC21 -AREA DE TRABALHO - CLINICA.docx
@@ -2465,15 +2465,7 @@
           <w:rFonts w:ascii="Segoe UI" w:eastAsiaTheme="majorEastAsia" w:hAnsi="Segoe UI" w:cs="Segoe UI"/>
           <w:color w:val="404040"/>
         </w:rPr>
-        <w:t>consultas do</w:t>
-      </w:r>
-      <w:r>
-        <w:rPr>
-          <w:rStyle w:val="Forte"/>
-          <w:rFonts w:ascii="Segoe UI" w:eastAsiaTheme="majorEastAsia" w:hAnsi="Segoe UI" w:cs="Segoe UI"/>
-          <w:color w:val="404040"/>
-        </w:rPr>
-        <w:t xml:space="preserve"> </w:t>
+        <w:t xml:space="preserve">consultas do </w:t>
       </w:r>
       <w:r>
         <w:rPr>
@@ -2489,29 +2481,14 @@
           <w:rFonts w:ascii="Segoe UI" w:eastAsiaTheme="majorEastAsia" w:hAnsi="Segoe UI" w:cs="Segoe UI"/>
           <w:color w:val="404040"/>
         </w:rPr>
-        <w:t xml:space="preserve"> </w:t>
-      </w:r>
-      <w:r>
-        <w:rPr>
-          <w:rStyle w:val="Forte"/>
-          <w:rFonts w:ascii="Segoe UI" w:eastAsiaTheme="majorEastAsia" w:hAnsi="Segoe UI" w:cs="Segoe UI"/>
-          <w:color w:val="404040"/>
-        </w:rPr>
-        <w:t>mês</w:t>
+        <w:t xml:space="preserve"> mês</w:t>
       </w:r>
       <w:r>
         <w:rPr>
           <w:rFonts w:ascii="Segoe UI" w:hAnsi="Segoe UI" w:cs="Segoe UI"/>
           <w:color w:val="404040"/>
         </w:rPr>
-        <w:t>,</w:t>
-      </w:r>
-      <w:r>
-        <w:rPr>
-          <w:rFonts w:ascii="Segoe UI" w:hAnsi="Segoe UI" w:cs="Segoe UI"/>
-          <w:color w:val="404040"/>
-        </w:rPr>
-        <w:t xml:space="preserve"> de todos os especialistas associados a </w:t>
+        <w:t xml:space="preserve">, de todos os especialistas associados a </w:t>
       </w:r>
       <w:r>
         <w:rPr>
@@ -2667,21 +2644,7 @@
           <w:rFonts w:ascii="Segoe UI" w:hAnsi="Segoe UI" w:cs="Segoe UI"/>
           <w:color w:val="404040"/>
         </w:rPr>
-        <w:t> →</w:t>
-      </w:r>
-      <w:r>
-        <w:rPr>
-          <w:rFonts w:ascii="Segoe UI" w:hAnsi="Segoe UI" w:cs="Segoe UI"/>
-          <w:color w:val="404040"/>
-        </w:rPr>
-        <w:t xml:space="preserve"> </w:t>
-      </w:r>
-      <w:r>
-        <w:rPr>
-          <w:rFonts w:ascii="Segoe UI" w:hAnsi="Segoe UI" w:cs="Segoe UI"/>
-          <w:color w:val="404040"/>
-        </w:rPr>
-        <w:t>Aciona </w:t>
+        <w:t> → Aciona </w:t>
       </w:r>
       <w:r>
         <w:rPr>
@@ -2759,15 +2722,7 @@
           <w:rFonts w:ascii="Segoe UI" w:eastAsiaTheme="majorEastAsia" w:hAnsi="Segoe UI" w:cs="Segoe UI"/>
           <w:color w:val="404040"/>
         </w:rPr>
-        <w:t xml:space="preserve">UC-24 Marcar Consultas - </w:t>
-      </w:r>
-      <w:r>
-        <w:rPr>
-          <w:rStyle w:val="Forte"/>
-          <w:rFonts w:ascii="Segoe UI" w:eastAsiaTheme="majorEastAsia" w:hAnsi="Segoe UI" w:cs="Segoe UI"/>
-          <w:color w:val="404040"/>
-        </w:rPr>
-        <w:t>Clínica</w:t>
+        <w:t>UC-24 Marcar Consultas - Clínica</w:t>
       </w:r>
       <w:r>
         <w:rPr>
@@ -2960,7 +2915,7 @@
           <w:rFonts w:ascii="Segoe UI" w:eastAsiaTheme="majorEastAsia" w:hAnsi="Segoe UI" w:cs="Segoe UI"/>
           <w:color w:val="404040"/>
         </w:rPr>
-        <w:t>30</w:t>
+        <w:t>49</w:t>
       </w:r>
       <w:r>
         <w:rPr>

</xml_diff>